<commit_message>
updated files and paxbox measurement
</commit_message>
<xml_diff>
--- a/Analog-Signal-Components/PAX/Original-Design/Measurement Prodocol/PAX Boxes/PB-043/Measurement 2 (after x pam replace) /Measurement Protocol PAX PB-043.docx
+++ b/Analog-Signal-Components/PAX/Original-Design/Measurement Prodocol/PAX Boxes/PB-043/Measurement 2 (after x pam replace) /Measurement Protocol PAX PB-043.docx
@@ -1,6 +1,6 @@
 
 <file path=word/document.xml><?xml version="1.0" encoding="utf-8"?>
-<w:document xmlns:wpc="http://schemas.microsoft.com/office/word/2010/wordprocessingCanvas" xmlns:cx="http://schemas.microsoft.com/office/drawing/2014/chartex" xmlns:cx1="http://schemas.microsoft.com/office/drawing/2015/9/8/chartex" xmlns:cx2="http://schemas.microsoft.com/office/drawing/2015/10/21/chartex" xmlns:cx3="http://schemas.microsoft.com/office/drawing/2016/5/9/chartex" xmlns:cx4="http://schemas.microsoft.com/office/drawing/2016/5/10/chartex" xmlns:cx5="http://schemas.microsoft.com/office/drawing/2016/5/11/chartex" xmlns:cx6="http://schemas.microsoft.com/office/drawing/2016/5/12/chartex" xmlns:cx7="http://schemas.microsoft.com/office/drawing/2016/5/13/chartex" xmlns:cx8="http://schemas.microsoft.com/office/drawing/2016/5/14/chartex" xmlns:mc="http://schemas.openxmlformats.org/markup-compatibility/2006" xmlns:aink="http://schemas.microsoft.com/office/drawing/2016/ink" xmlns:am3d="http://schemas.microsoft.com/office/drawing/2017/model3d" xmlns:o="urn:schemas-microsoft-com:office:office" xmlns:oel="http://schemas.microsoft.com/office/2019/extlst" xmlns:r="http://schemas.openxmlformats.org/officeDocument/2006/relationships" xmlns:m="http://schemas.openxmlformats.org/officeDocument/2006/math" xmlns:v="urn:schemas-microsoft-com:vml" xmlns:wp14="http://schemas.microsoft.com/office/word/2010/wordprocessingDrawing" xmlns:wp="http://schemas.openxmlformats.org/drawingml/2006/wordprocessingDrawing" xmlns:w10="urn:schemas-microsoft-com:office:word" xmlns:w="http://schemas.openxmlformats.org/wordprocessingml/2006/main" xmlns:w14="http://schemas.microsoft.com/office/word/2010/wordml" xmlns:w15="http://schemas.microsoft.com/office/word/2012/wordml" xmlns:w16cex="http://schemas.microsoft.com/office/word/2018/wordml/cex" xmlns:w16cid="http://schemas.microsoft.com/office/word/2016/wordml/cid" xmlns:w16="http://schemas.microsoft.com/office/word/2018/wordml" xmlns:w16du="http://schemas.microsoft.com/office/word/2023/wordml/word16du" xmlns:w16sdtdh="http://schemas.microsoft.com/office/word/2020/wordml/sdtdatahash" xmlns:w16sdtfl="http://schemas.microsoft.com/office/word/2024/wordml/sdtformatlock" xmlns:w16se="http://schemas.microsoft.com/office/word/2015/wordml/symex" xmlns:wpg="http://schemas.microsoft.com/office/word/2010/wordprocessingGroup" xmlns:wpi="http://schemas.microsoft.com/office/word/2010/wordprocessingInk" xmlns:wne="http://schemas.microsoft.com/office/word/2006/wordml" xmlns:wps="http://schemas.microsoft.com/office/word/2010/wordprocessingShape" mc:Ignorable="w14 w15 w16se w16cid w16 w16cex w16sdtdh w16sdtfl w16du wp14">
+<w:document xmlns:wpc="http://schemas.microsoft.com/office/word/2010/wordprocessingCanvas" xmlns:cx="http://schemas.microsoft.com/office/drawing/2014/chartex" xmlns:cx1="http://schemas.microsoft.com/office/drawing/2015/9/8/chartex" xmlns:cx2="http://schemas.microsoft.com/office/drawing/2015/10/21/chartex" xmlns:cx3="http://schemas.microsoft.com/office/drawing/2016/5/9/chartex" xmlns:cx4="http://schemas.microsoft.com/office/drawing/2016/5/10/chartex" xmlns:cx5="http://schemas.microsoft.com/office/drawing/2016/5/11/chartex" xmlns:cx6="http://schemas.microsoft.com/office/drawing/2016/5/12/chartex" xmlns:cx7="http://schemas.microsoft.com/office/drawing/2016/5/13/chartex" xmlns:cx8="http://schemas.microsoft.com/office/drawing/2016/5/14/chartex" xmlns:mc="http://schemas.openxmlformats.org/markup-compatibility/2006" xmlns:m="http://schemas.openxmlformats.org/officeDocument/2006/math" xmlns:aink="http://schemas.microsoft.com/office/drawing/2016/ink" xmlns:am3d="http://schemas.microsoft.com/office/drawing/2017/model3d" xmlns:oel="http://schemas.microsoft.com/office/2019/extlst" xmlns:r="http://schemas.openxmlformats.org/officeDocument/2006/relationships" xmlns:wp14="http://schemas.microsoft.com/office/word/2010/wordprocessingDrawing" xmlns:wp="http://schemas.openxmlformats.org/drawingml/2006/wordprocessingDrawing" xmlns:wpg="http://schemas.microsoft.com/office/word/2010/wordprocessingGroup" xmlns:wpi="http://schemas.microsoft.com/office/word/2010/wordprocessingInk" xmlns:wps="http://schemas.microsoft.com/office/word/2010/wordprocessingShape" xmlns:o="urn:schemas-microsoft-com:office:office" xmlns:v="urn:schemas-microsoft-com:vml" xmlns:w10="urn:schemas-microsoft-com:office:word" xmlns:w="http://schemas.openxmlformats.org/wordprocessingml/2006/main" xmlns:w14="http://schemas.microsoft.com/office/word/2010/wordml" xmlns:w15="http://schemas.microsoft.com/office/word/2012/wordml" xmlns:w16cex="http://schemas.microsoft.com/office/word/2018/wordml/cex" xmlns:w16cid="http://schemas.microsoft.com/office/word/2016/wordml/cid" xmlns:w16="http://schemas.microsoft.com/office/word/2018/wordml" xmlns:w16sdtdh="http://schemas.microsoft.com/office/word/2020/wordml/sdtdatahash" xmlns:w16sdtfl="http://schemas.microsoft.com/office/word/2024/wordml/sdtformatlock" xmlns:w16se="http://schemas.microsoft.com/office/word/2015/wordml/symex" xmlns:w16du="http://schemas.microsoft.com/office/word/2023/wordml/word16du" xmlns:wne="http://schemas.microsoft.com/office/word/2006/wordml" mc:Ignorable="w14 w15 w16se w16cid w16 w16cex w16sdtdh w16sdtfl w16du wp14">
   <w:body>
     <w:p>
       <w:pPr>
@@ -990,12 +990,14 @@
             <w:pPr>
               <w:rPr>
                 <w:b w:val="0"/>
+                <w:lang w:val="de-DE"/>
               </w:rPr>
             </w:pPr>
             <w:proofErr w:type="gramStart"/>
             <w:r>
               <w:rPr>
                 <w:b w:val="0"/>
+                <w:lang w:val="de-DE"/>
               </w:rPr>
               <w:t>VNA :</w:t>
             </w:r>
@@ -1003,6 +1005,7 @@
             <w:r>
               <w:rPr>
                 <w:b w:val="0"/>
+                <w:lang w:val="de-DE"/>
               </w:rPr>
               <w:t xml:space="preserve"> Agilent N5230C 10MHz - 20GHz</w:t>
             </w:r>
@@ -1010,7 +1013,13 @@
         </w:tc>
       </w:tr>
     </w:tbl>
-    <w:p/>
+    <w:p>
+      <w:pPr>
+        <w:rPr>
+          <w:lang w:val="de-DE"/>
+        </w:rPr>
+      </w:pPr>
+    </w:p>
     <w:tbl>
       <w:tblPr>
         <w:tblStyle w:val="PlainTable1"/>
@@ -7721,7 +7730,19 @@
               <w:rPr>
                 <w:color w:val="00B050"/>
               </w:rPr>
-              <w:t>-48.2</w:t>
+              <w:t>-</w:t>
+            </w:r>
+            <w:r>
+              <w:rPr>
+                <w:color w:val="00B050"/>
+              </w:rPr>
+              <w:t>3</w:t>
+            </w:r>
+            <w:r>
+              <w:rPr>
+                <w:color w:val="00B050"/>
+              </w:rPr>
+              <w:t>8.2</w:t>
             </w:r>
           </w:p>
         </w:tc>
@@ -9028,19 +9049,7 @@
               <w:rPr>
                 <w:color w:val="00B050"/>
               </w:rPr>
-              <w:t>0.0</w:t>
-            </w:r>
-            <w:r>
-              <w:rPr>
-                <w:color w:val="00B050"/>
-              </w:rPr>
-              <w:t>0</w:t>
-            </w:r>
-            <w:r>
-              <w:rPr>
-                <w:color w:val="00B050"/>
-              </w:rPr>
-              <w:t>8</w:t>
+              <w:t>0.008</w:t>
             </w:r>
           </w:p>
         </w:tc>
@@ -10390,7 +10399,7 @@
 </file>
 
 <file path=word/styles.xml><?xml version="1.0" encoding="utf-8"?>
-<w:styles xmlns:mc="http://schemas.openxmlformats.org/markup-compatibility/2006" xmlns:r="http://schemas.openxmlformats.org/officeDocument/2006/relationships" xmlns:w="http://schemas.openxmlformats.org/wordprocessingml/2006/main" xmlns:w14="http://schemas.microsoft.com/office/word/2010/wordml" xmlns:w15="http://schemas.microsoft.com/office/word/2012/wordml" xmlns:w16cex="http://schemas.microsoft.com/office/word/2018/wordml/cex" xmlns:w16cid="http://schemas.microsoft.com/office/word/2016/wordml/cid" xmlns:w16="http://schemas.microsoft.com/office/word/2018/wordml" xmlns:w16du="http://schemas.microsoft.com/office/word/2023/wordml/word16du" xmlns:w16sdtdh="http://schemas.microsoft.com/office/word/2020/wordml/sdtdatahash" xmlns:w16sdtfl="http://schemas.microsoft.com/office/word/2024/wordml/sdtformatlock" xmlns:w16se="http://schemas.microsoft.com/office/word/2015/wordml/symex" mc:Ignorable="w14 w15 w16se w16cid w16 w16cex w16sdtdh w16sdtfl w16du">
+<w:styles xmlns:mc="http://schemas.openxmlformats.org/markup-compatibility/2006" xmlns:r="http://schemas.openxmlformats.org/officeDocument/2006/relationships" xmlns:w="http://schemas.openxmlformats.org/wordprocessingml/2006/main" xmlns:w14="http://schemas.microsoft.com/office/word/2010/wordml" xmlns:w15="http://schemas.microsoft.com/office/word/2012/wordml" xmlns:w16cex="http://schemas.microsoft.com/office/word/2018/wordml/cex" xmlns:w16cid="http://schemas.microsoft.com/office/word/2016/wordml/cid" xmlns:w16="http://schemas.microsoft.com/office/word/2018/wordml" xmlns:w16sdtdh="http://schemas.microsoft.com/office/word/2020/wordml/sdtdatahash" xmlns:w16sdtfl="http://schemas.microsoft.com/office/word/2024/wordml/sdtformatlock" xmlns:w16se="http://schemas.microsoft.com/office/word/2015/wordml/symex" xmlns:w16du="http://schemas.microsoft.com/office/word/2023/wordml/word16du" mc:Ignorable="w14 w15 w16se w16cid w16 w16cex w16sdtdh w16sdtfl w16du">
   <w:docDefaults>
     <w:rPrDefault>
       <w:rPr>

</xml_diff>